<commit_message>
docs: define MySQL como motor de base de datos oficial en la bitacora (#4)
</commit_message>
<xml_diff>
--- a/docs/BITACORA_DE_DECISIONES_TECNICAS.docx
+++ b/docs/BITACORA_DE_DECISIONES_TECNICAS.docx
@@ -1,6 +1,6 @@
 
 <file path=word/document.xml><?xml version="1.0" encoding="utf-8"?>
-<w:document xmlns:wpc="http://schemas.microsoft.com/office/word/2010/wordprocessingCanvas" xmlns:mc="http://schemas.openxmlformats.org/markup-compatibility/2006" xmlns:o="urn:schemas-microsoft-com:office:office" xmlns:r="http://schemas.openxmlformats.org/officeDocument/2006/relationships" xmlns:m="http://schemas.openxmlformats.org/officeDocument/2006/math" xmlns:v="urn:schemas-microsoft-com:vml" xmlns:wp14="http://schemas.microsoft.com/office/word/2010/wordprocessingDrawing" xmlns:wp="http://schemas.openxmlformats.org/drawingml/2006/wordprocessingDrawing" xmlns:w10="urn:schemas-microsoft-com:office:word" xmlns:w="http://schemas.openxmlformats.org/wordprocessingml/2006/main" xmlns:w14="http://schemas.microsoft.com/office/word/2010/wordml" xmlns:w15="http://schemas.microsoft.com/office/word/2012/wordml" xmlns:wpg="http://schemas.microsoft.com/office/word/2010/wordprocessingGroup" xmlns:wpi="http://schemas.microsoft.com/office/word/2010/wordprocessingInk" xmlns:wne="http://schemas.microsoft.com/office/word/2006/wordml" xmlns:wps="http://schemas.microsoft.com/office/word/2010/wordprocessingShape" xmlns:cx="http://schemas.microsoft.com/office/drawing/2014/chartex" xmlns:cx1="http://schemas.microsoft.com/office/drawing/2015/9/8/chartex" xmlns:cx2="http://schemas.microsoft.com/office/drawing/2015/10/21/chartex" xmlns:cx3="http://schemas.microsoft.com/office/drawing/2016/5/9/chartex" xmlns:cx4="http://schemas.microsoft.com/office/drawing/2016/5/10/chartex" xmlns:cx5="http://schemas.microsoft.com/office/drawing/2016/5/11/chartex" xmlns:cx6="http://schemas.microsoft.com/office/drawing/2016/5/12/chartex" xmlns:cx7="http://schemas.microsoft.com/office/drawing/2016/5/13/chartex" xmlns:cx8="http://schemas.microsoft.com/office/drawing/2016/5/14/chartex" xmlns:aink="http://schemas.microsoft.com/office/drawing/2016/ink" xmlns:am3d="http://schemas.microsoft.com/office/drawing/2017/model3d" xmlns:w16cex="http://schemas.microsoft.com/office/word/2018/wordml/cex" xmlns:w16cid="http://schemas.microsoft.com/office/word/2016/wordml/cid" xmlns:w16="http://schemas.microsoft.com/office/word/2018/wordml" xmlns:w16sdtdh="http://schemas.microsoft.com/office/word/2020/wordml/sdtdatahash" xmlns:w16se="http://schemas.microsoft.com/office/word/2015/wordml/symex" mc:Ignorable="w14 w15 wp14">
+<w:document xmlns:ns1="http://schemas.openxmlformats.org/markup-compatibility/2006" xmlns:w="http://schemas.openxmlformats.org/wordprocessingml/2006/main" ns1:Ignorable="w14 w15 wp14">
   <w:body>
     <w:p>
       <w:pPr>
@@ -1034,7 +1034,7 @@
                 <w:sz w:val="19"/>
                 <w:szCs w:val="19"/>
               </w:rPr>
-              <w:t xml:space="preserve"/>
+              <w:t xml:space="preserve">2026-10-11</w:t>
             </w:r>
           </w:p>
         </w:tc>
@@ -1061,7 +1061,7 @@
                 <w:sz w:val="19"/>
                 <w:szCs w:val="19"/>
               </w:rPr>
-              <w:t xml:space="preserve"/>
+              <w:t xml:space="preserve">Se define formalmente MySQL (versión 8.0+) como el motor de base de datos relacional oficial del proyecto. Backend usará el driver mysql-connector-j con Spring Data JPA y se mantiene total compatibilidad con los scripts SQL e InnoDB definidos en la carpeta database.</w:t>
             </w:r>
           </w:p>
         </w:tc>
@@ -1088,7 +1088,7 @@
                 <w:sz w:val="19"/>
                 <w:szCs w:val="19"/>
               </w:rPr>
-              <w:t xml:space="preserve"/>
+              <w:t xml:space="preserve">Backend + Base de Datos</w:t>
             </w:r>
           </w:p>
         </w:tc>
@@ -1115,7 +1115,7 @@
                 <w:sz w:val="19"/>
                 <w:szCs w:val="19"/>
               </w:rPr>
-              <w:t xml:space="preserve"/>
+              <w:t xml:space="preserve">Backend, Base de Datos, QA</w:t>
             </w:r>
           </w:p>
         </w:tc>
@@ -1142,7 +1142,7 @@
                 <w:sz w:val="19"/>
                 <w:szCs w:val="19"/>
               </w:rPr>
-              <w:t xml:space="preserve">☐ Abierta</w:t>
+              <w:t xml:space="preserve">✅ Cerrada</w:t>
             </w:r>
           </w:p>
         </w:tc>

</xml_diff>

<commit_message>
docs: corrige ubicacion de entrada en bitacora
</commit_message>
<xml_diff>
--- a/docs/BITACORA_DE_DECISIONES_TECNICAS.docx
+++ b/docs/BITACORA_DE_DECISIONES_TECNICAS.docx
@@ -1200,6 +1200,9 @@
               </w:rPr>
               <w:t xml:space="preserve"/>
             </w:r>
+            <w:r>
+              <w:t>2026-10-16</w:t>
+            </w:r>
           </w:p>
         </w:tc>
         <w:tc>
@@ -1227,6 +1230,9 @@
               </w:rPr>
               <w:t xml:space="preserve"/>
             </w:r>
+            <w:r>
+              <w:t>Frontend tarea 2 invoca POST /api/rooms/{pin}/join mediante una ruta relativa, sin fijar host ni puerto. Queda pendiente acordar cómo se servirá el Frontend respecto al Backend en desarrollo y despliegue (mismo origen/proxy o CORS); no se asumirá una URL base hasta validarlo entre ambos equipos.</w:t>
+            </w:r>
           </w:p>
         </w:tc>
         <w:tc>
@@ -1254,6 +1260,9 @@
               </w:rPr>
               <w:t xml:space="preserve"/>
             </w:r>
+            <w:r>
+              <w:t>Frontend + Backend</w:t>
+            </w:r>
           </w:p>
         </w:tc>
         <w:tc>
@@ -1280,6 +1289,9 @@
                 <w:szCs w:val="19"/>
               </w:rPr>
               <w:t xml:space="preserve"/>
+            </w:r>
+            <w:r>
+              <w:t>Frontend, Backend, QA</w:t>
             </w:r>
           </w:p>
         </w:tc>

</xml_diff>